<commit_message>
LockonDocs backup - 2026-08-30 14:16:29 UTC
</commit_message>
<xml_diff>
--- a/docs/CUSTOM_INSTRUCTIONS.docx
+++ b/docs/CUSTOM_INSTRUCTIONS.docx
@@ -357,7 +357,7 @@
         <w:t xml:space="preserve"> </w:t>
       </w:r>
       <w:r>
-        <w:t xml:space="preserve">Always checkpoint and wait for explicit manual deploy instruction from the developer. The live app runs on two hosts (lockondocs.abacusai.app and securevault.dowmandigitalservices.com); a deploy must update both.</w:t>
+        <w:t xml:space="preserve">Always checkpoint and wait for explicit manual deploy instruction from the developer. As of Build 20 the service was migrated to the new primary host vault.lockondocs.app; deploy there. The previous hosts (securevault.dowmandigitalservices.com and lockondocs.abacusai.app) are pending a retire-or-keep decision from the developer - until confirmed, check with the developer which hosts a deploy should update.</w:t>
       </w:r>
     </w:p>
     <w:p>
@@ -564,7 +564,7 @@
         <w:t xml:space="preserve">build_state.md</w:t>
       </w:r>
       <w:r>
-        <w:t xml:space="preserve">. Current counter: 17.</w:t>
+        <w:t xml:space="preserve">. Current counter: 20.</w:t>
       </w:r>
     </w:p>
     <w:p>
@@ -1394,7 +1394,7 @@
               <w:jc w:val="left"/>
             </w:pPr>
             <w:r>
-              <w:t xml:space="preserve">Manual only (two hosts)</w:t>
+              <w:t xml:space="preserve">Manual only (primary host vault.lockondocs.app)</w:t>
             </w:r>
           </w:p>
         </w:tc>
@@ -1498,7 +1498,7 @@
               <w:jc w:val="left"/>
             </w:pPr>
             <w:r>
-              <w:t xml:space="preserve">17</w:t>
+              <w:t xml:space="preserve">20</w:t>
             </w:r>
           </w:p>
         </w:tc>

</xml_diff>

<commit_message>
LockonDocs backup - 2026-09-13 14:08:53 UTC
</commit_message>
<xml_diff>
--- a/docs/CUSTOM_INSTRUCTIONS.docx
+++ b/docs/CUSTOM_INSTRUCTIONS.docx
@@ -2,7 +2,7 @@
 <file path=word/document.xml><?xml version="1.0" encoding="utf-8"?>
 <w:document xmlns:w="http://schemas.openxmlformats.org/wordprocessingml/2006/main" xmlns:m="http://schemas.openxmlformats.org/officeDocument/2006/math" xmlns:r="http://schemas.openxmlformats.org/officeDocument/2006/relationships" xmlns:o="urn:schemas-microsoft-com:office:office" xmlns:v="urn:schemas-microsoft-com:vml" xmlns:w10="urn:schemas-microsoft-com:office:word" xmlns:a="http://schemas.openxmlformats.org/drawingml/2006/main" xmlns:pic="http://schemas.openxmlformats.org/drawingml/2006/picture" xmlns:wp="http://schemas.openxmlformats.org/drawingml/2006/wordprocessingDrawing">
   <w:body>
-    <w:bookmarkStart w:id="38" w:name="lockondocs---custom-instructions"/>
+    <w:bookmarkStart w:id="42" w:name="lockondocs---custom-instructions"/>
     <w:p>
       <w:pPr>
         <w:pStyle w:val="Heading1"/>
@@ -357,7 +357,7 @@
         <w:t xml:space="preserve"> </w:t>
       </w:r>
       <w:r>
-        <w:t xml:space="preserve">Always checkpoint and wait for explicit manual deploy instruction from the developer. As of Build 20 the service was migrated to the new primary host vault.lockondocs.app; deploy there. The previous hosts (securevault.dowmandigitalservices.com and lockondocs.abacusai.app) are pending a retire-or-keep decision from the developer - until confirmed, check with the developer which hosts a deploy should update.</w:t>
+        <w:t xml:space="preserve">Always checkpoint and wait for an explicit manual deploy instruction from the developer. vault.lockondocs.app is the single live host and the only deploy target. The previous hosts (securevault.dowmandigitalservices.com and lockondocs.abacusai.app) were retired on 2026-08-31.</w:t>
       </w:r>
     </w:p>
     <w:p>
@@ -564,7 +564,7 @@
         <w:t xml:space="preserve">build_state.md</w:t>
       </w:r>
       <w:r>
-        <w:t xml:space="preserve">. Current counter: 20.</w:t>
+        <w:t xml:space="preserve">. Current counter: 31.</w:t>
       </w:r>
     </w:p>
     <w:p>
@@ -1167,12 +1167,141 @@
     </w:p>
     <w:bookmarkEnd w:id="34"/>
     <w:bookmarkEnd w:id="35"/>
-    <w:bookmarkStart w:id="36" w:name="key-contacts"/>
+    <w:bookmarkStart w:id="39" w:name="Xd9aee4c3d7e5eb1e212c82b69c84de3825b759c"/>
     <w:p>
       <w:pPr>
         <w:pStyle w:val="Heading2"/>
       </w:pPr>
       <w:r>
+        <w:t xml:space="preserve">Client Architecture Phases (Digital Vault Architecture document)</w:t>
+      </w:r>
+    </w:p>
+    <w:p>
+      <w:pPr>
+        <w:pStyle w:val="FirstParagraph"/>
+      </w:pPr>
+      <w:r>
+        <w:t xml:space="preserve">These are the tiers from Tracey’s Digital Vault Architecture brief, tracked separately from the delivery phases above. All three are built (Builds 25 to 31) and awaiting manual deploy.</w:t>
+      </w:r>
+    </w:p>
+    <w:bookmarkStart w:id="36" w:name="X724a96b375656f3abf7f88f923025c9191a8321"/>
+    <w:p>
+      <w:pPr>
+        <w:pStyle w:val="Heading3"/>
+      </w:pPr>
+      <w:r>
+        <w:t xml:space="preserve">Phase A - Structured vault fields (built, Build 25)</w:t>
+      </w:r>
+    </w:p>
+    <w:p>
+      <w:pPr>
+        <w:numPr>
+          <w:ilvl w:val="0"/>
+          <w:numId w:val="1013"/>
+        </w:numPr>
+        <w:pStyle w:val="Compact"/>
+      </w:pPr>
+      <w:r>
+        <w:t xml:space="preserve">Per-vault metadata fields, a custom field builder, and cross-field search so users can store and find structured details (for example an ID number or policy number) alongside each document.</w:t>
+      </w:r>
+    </w:p>
+    <w:bookmarkEnd w:id="36"/>
+    <w:bookmarkStart w:id="37" w:name="Xd5ba8a24927b5d89f4b530a45c83d0075262fc6"/>
+    <w:p>
+      <w:pPr>
+        <w:pStyle w:val="Heading3"/>
+      </w:pPr>
+      <w:r>
+        <w:t xml:space="preserve">Phase B - Expiry reminders (built, Builds 28 to 30)</w:t>
+      </w:r>
+    </w:p>
+    <w:p>
+      <w:pPr>
+        <w:numPr>
+          <w:ilvl w:val="0"/>
+          <w:numId w:val="1014"/>
+        </w:numPr>
+        <w:pStyle w:val="Compact"/>
+      </w:pPr>
+      <w:r>
+        <w:t xml:space="preserve">In-app expiry reminders (bell/badge), plus two branded reminder emails per expiry cycle: one</w:t>
+      </w:r>
+      <w:r>
+        <w:t xml:space="preserve"> </w:t>
+      </w:r>
+      <w:r>
+        <w:t xml:space="preserve">“</w:t>
+      </w:r>
+      <w:r>
+        <w:t xml:space="preserve">expiring soon</w:t>
+      </w:r>
+      <w:r>
+        <w:t xml:space="preserve">”</w:t>
+      </w:r>
+      <w:r>
+        <w:t xml:space="preserve"> </w:t>
+      </w:r>
+      <w:r>
+        <w:t xml:space="preserve">(within 30 days) and one</w:t>
+      </w:r>
+      <w:r>
+        <w:t xml:space="preserve"> </w:t>
+      </w:r>
+      <w:r>
+        <w:t xml:space="preserve">“</w:t>
+      </w:r>
+      <w:r>
+        <w:t xml:space="preserve">expired</w:t>
+      </w:r>
+      <w:r>
+        <w:t xml:space="preserve">”</w:t>
+      </w:r>
+      <w:r>
+        <w:t xml:space="preserve">. No push notifications, because the app runs embedded in the GoodBarber shell. A per-user opt-out toggle and an admin email log are included. Build 30 fixed a 30-day boundary so a document exactly 30 days out is included.</w:t>
+      </w:r>
+    </w:p>
+    <w:bookmarkEnd w:id="37"/>
+    <w:bookmarkStart w:id="38" w:name="phase-c---access-security-built-build-31"/>
+    <w:p>
+      <w:pPr>
+        <w:pStyle w:val="Heading3"/>
+      </w:pPr>
+      <w:r>
+        <w:t xml:space="preserve">Phase C - Access security (built, Build 31)</w:t>
+      </w:r>
+    </w:p>
+    <w:p>
+      <w:pPr>
+        <w:numPr>
+          <w:ilvl w:val="0"/>
+          <w:numId w:val="1015"/>
+        </w:numPr>
+        <w:pStyle w:val="Compact"/>
+      </w:pPr>
+      <w:r>
+        <w:t xml:space="preserve">Auto-lock (choices 1, 3, 5, 10 minutes or Never; default 5) that also locks when the app is backgrounded and reopened, masked sensitive field values that require a password reveal, and a re-authentication endpoint. The lock is an in-app overlay, not a sign-out, so the GoodBarber session survives.</w:t>
+      </w:r>
+    </w:p>
+    <w:p>
+      <w:pPr>
+        <w:numPr>
+          <w:ilvl w:val="0"/>
+          <w:numId w:val="1015"/>
+        </w:numPr>
+        <w:pStyle w:val="Compact"/>
+      </w:pPr>
+      <w:r>
+        <w:t xml:space="preserve">Still open (need a separate go-ahead): document sharing, multi-person profiles, encryption at rest (accepted risk, not built).</w:t>
+      </w:r>
+    </w:p>
+    <w:bookmarkEnd w:id="38"/>
+    <w:bookmarkEnd w:id="39"/>
+    <w:bookmarkStart w:id="40" w:name="key-contacts"/>
+    <w:p>
+      <w:pPr>
+        <w:pStyle w:val="Heading2"/>
+      </w:pPr>
+      <w:r>
         <w:t xml:space="preserve">Key Contacts</w:t>
       </w:r>
     </w:p>
@@ -1180,7 +1309,7 @@
       <w:pPr>
         <w:numPr>
           <w:ilvl w:val="0"/>
-          <w:numId w:val="1013"/>
+          <w:numId w:val="1016"/>
         </w:numPr>
         <w:pStyle w:val="Compact"/>
       </w:pPr>
@@ -1202,7 +1331,7 @@
       <w:pPr>
         <w:numPr>
           <w:ilvl w:val="0"/>
-          <w:numId w:val="1013"/>
+          <w:numId w:val="1016"/>
         </w:numPr>
         <w:pStyle w:val="Compact"/>
       </w:pPr>
@@ -1220,8 +1349,8 @@
         <w:t xml:space="preserve">(Eazi-Business, UK) - Build and deployment</w:t>
       </w:r>
     </w:p>
-    <w:bookmarkEnd w:id="36"/>
-    <w:bookmarkStart w:id="37" w:name="quick-reference"/>
+    <w:bookmarkEnd w:id="40"/>
+    <w:bookmarkStart w:id="41" w:name="quick-reference"/>
     <w:p>
       <w:pPr>
         <w:pStyle w:val="Heading2"/>
@@ -1233,7 +1362,7 @@
     <w:tbl>
       <w:tblPr>
         <w:tblStyle w:val="Table"/>
-        <w:tblW w:type="auto" w:w="0"/>
+        <w:tblW w:type="pct" w:w="5000"/>
         <w:tblLook w:firstRow="1" w:lastRow="0" w:firstColumn="0" w:lastColumn="0" w:noHBand="0" w:noVBand="0" w:val="0020"/>
       </w:tblPr>
       <w:tblGrid>
@@ -1498,7 +1627,7 @@
               <w:jc w:val="left"/>
             </w:pPr>
             <w:r>
-              <w:t xml:space="preserve">20</w:t>
+              <w:t xml:space="preserve">31</w:t>
             </w:r>
           </w:p>
         </w:tc>
@@ -1524,14 +1653,14 @@
               <w:jc w:val="left"/>
             </w:pPr>
             <w:r>
-              <w:t xml:space="preserve">Phase 2 complete; Phase 3 next</w:t>
+              <w:t xml:space="preserve">Phases 1 and 2 complete; client Phases A, B and C built (Builds 25 to 31); Phase 3 (GoodBarber) next</w:t>
             </w:r>
           </w:p>
         </w:tc>
       </w:tr>
     </w:tbl>
-    <w:bookmarkEnd w:id="37"/>
-    <w:bookmarkEnd w:id="38"/>
+    <w:bookmarkEnd w:id="41"/>
+    <w:bookmarkEnd w:id="42"/>
     <w:sectPr/>
   </w:body>
 </w:document>
@@ -1866,6 +1995,15 @@
     <w:abstractNumId w:val="991"/>
   </w:num>
   <w:num w:numId="1013">
+    <w:abstractNumId w:val="991"/>
+  </w:num>
+  <w:num w:numId="1014">
+    <w:abstractNumId w:val="991"/>
+  </w:num>
+  <w:num w:numId="1015">
+    <w:abstractNumId w:val="991"/>
+  </w:num>
+  <w:num w:numId="1016">
     <w:abstractNumId w:val="991"/>
   </w:num>
 </w:numbering>

</xml_diff>

<commit_message>
LockonDocs backup - 2026-09-20 14:05:50 UTC
</commit_message>
<xml_diff>
--- a/docs/CUSTOM_INSTRUCTIONS.docx
+++ b/docs/CUSTOM_INSTRUCTIONS.docx
@@ -564,7 +564,7 @@
         <w:t xml:space="preserve">build_state.md</w:t>
       </w:r>
       <w:r>
-        <w:t xml:space="preserve">. Current counter: 31.</w:t>
+        <w:t xml:space="preserve">. Current counter: 37.</w:t>
       </w:r>
     </w:p>
     <w:p>
@@ -1279,7 +1279,7 @@
         <w:pStyle w:val="Compact"/>
       </w:pPr>
       <w:r>
-        <w:t xml:space="preserve">Auto-lock (choices 1, 3, 5, 10 minutes or Never; default 5) that also locks when the app is backgrounded and reopened, masked sensitive field values that require a password reveal, and a re-authentication endpoint. The lock is an in-app overlay, not a sign-out, so the GoodBarber session survives.</w:t>
+        <w:t xml:space="preserve">Auto-lock (choices 1, 3, 5, 10 minutes or Never; default 5) that also locks on return when the app has been left in the background for at least that same period (Build 34 changed this from locking on any return), masked sensitive field values that require a password reveal, and a re-authentication endpoint. The lock is an in-app overlay, not a sign-out, so the GoodBarber session survives, and it is never shown straight after a sign-in.</w:t>
       </w:r>
     </w:p>
     <w:p>
@@ -1627,7 +1627,7 @@
               <w:jc w:val="left"/>
             </w:pPr>
             <w:r>
-              <w:t xml:space="preserve">31</w:t>
+              <w:t xml:space="preserve">37</w:t>
             </w:r>
           </w:p>
         </w:tc>

</xml_diff>

<commit_message>
LockonDocs backup - 2026-10-11 14:04:36 UTC
</commit_message>
<xml_diff>
--- a/docs/CUSTOM_INSTRUCTIONS.docx
+++ b/docs/CUSTOM_INSTRUCTIONS.docx
@@ -523,6 +523,42 @@
         <w:t xml:space="preserve">Always in GBP with USD conversion at ~1.27 rate. Example: £100 ($127 USD).</w:t>
       </w:r>
     </w:p>
+    <w:p>
+      <w:pPr>
+        <w:numPr>
+          <w:ilvl w:val="0"/>
+          <w:numId w:val="1002"/>
+        </w:numPr>
+      </w:pPr>
+      <w:r>
+        <w:rPr>
+          <w:bCs/>
+          <w:b/>
+        </w:rPr>
+        <w:t xml:space="preserve">US English, always.</w:t>
+      </w:r>
+      <w:r>
+        <w:t xml:space="preserve"> </w:t>
+      </w:r>
+      <w:r>
+        <w:t xml:space="preserve">Every word a user or the client sees is US English: app screens, labels, buttons, messages, default vault fields and options, emails, the data export, page metadata, and client-facing docs and replies. Use US spellings (organize, color, center, license, behavior, canceled, gray, optimization, defense) and US date formats (en-US locale, M/D/YYYY, for example 10/6/2026). Set</w:t>
+      </w:r>
+      <w:r>
+        <w:t xml:space="preserve"> </w:t>
+      </w:r>
+      <w:r>
+        <w:rPr>
+          <w:rStyle w:val="VerbatimChar"/>
+        </w:rPr>
+        <w:t xml:space="preserve">lang="en-US"</w:t>
+      </w:r>
+      <w:r>
+        <w:t xml:space="preserve"> </w:t>
+      </w:r>
+      <w:r>
+        <w:t xml:space="preserve">on generated HTML. Never rename stored keys or database values just for spelling (for example a field key or a code identifier); change only what is displayed, and ask before any backfill of existing user data. The developer is UK-based, so check every new piece of text for UK spellings before a build is checkpointed. (Added in Build 40.)</w:t>
+      </w:r>
+    </w:p>
     <w:bookmarkEnd w:id="22"/>
     <w:bookmarkStart w:id="23" w:name="build-tracking"/>
     <w:p>
@@ -564,7 +600,7 @@
         <w:t xml:space="preserve">build_state.md</w:t>
       </w:r>
       <w:r>
-        <w:t xml:space="preserve">. Current counter: 37.</w:t>
+        <w:t xml:space="preserve">. Current counter: 43.</w:t>
       </w:r>
     </w:p>
     <w:p>
@@ -753,6 +789,27 @@
       </w:r>
       <w:r>
         <w:t xml:space="preserve">- Production deployment, security posture and accepted risks</w:t>
+      </w:r>
+      <w:r>
+        <w:t xml:space="preserve"> </w:t>
+      </w:r>
+      <w:r>
+        <w:t xml:space="preserve">-</w:t>
+      </w:r>
+      <w:r>
+        <w:t xml:space="preserve"> </w:t>
+      </w:r>
+      <w:r>
+        <w:rPr>
+          <w:rStyle w:val="VerbatimChar"/>
+        </w:rPr>
+        <w:t xml:space="preserve">sharing_offline_review.md</w:t>
+      </w:r>
+      <w:r>
+        <w:t xml:space="preserve"> </w:t>
+      </w:r>
+      <w:r>
+        <w:t xml:space="preserve">- Review of document sharing and offline access against the original planning (Build 40)</w:t>
       </w:r>
     </w:p>
     <w:p>
@@ -922,7 +979,22 @@
         <w:pStyle w:val="Compact"/>
       </w:pPr>
       <w:r>
-        <w:t xml:space="preserve">Note: offline capture, caching and sync are not implemented yet.</w:t>
+        <w:t xml:space="preserve">Note: offline capture, caching and sync are not implemented yet. Offline access was in Tracey’s original requirements and the proposal’s Phase 2; see</w:t>
+      </w:r>
+      <w:r>
+        <w:t xml:space="preserve"> </w:t>
+      </w:r>
+      <w:r>
+        <w:rPr>
+          <w:rStyle w:val="VerbatimChar"/>
+        </w:rPr>
+        <w:t xml:space="preserve">sharing_offline_review.md</w:t>
+      </w:r>
+      <w:r>
+        <w:t xml:space="preserve"> </w:t>
+      </w:r>
+      <w:r>
+        <w:t xml:space="preserve">for the gap and a suggested scope.</w:t>
       </w:r>
     </w:p>
     <w:bookmarkEnd w:id="27"/>
@@ -1162,7 +1234,7 @@
         <w:pStyle w:val="Compact"/>
       </w:pPr>
       <w:r>
-        <w:t xml:space="preserve">Performance optimisation, final security audit, user acceptance testing, production deployment.</w:t>
+        <w:t xml:space="preserve">Performance optimization, final security audit, user acceptance testing, production deployment.</w:t>
       </w:r>
     </w:p>
     <w:bookmarkEnd w:id="34"/>
@@ -1291,7 +1363,22 @@
         <w:pStyle w:val="Compact"/>
       </w:pPr>
       <w:r>
-        <w:t xml:space="preserve">Still open (need a separate go-ahead): document sharing, multi-person profiles, encryption at rest (accepted risk, not built).</w:t>
+        <w:t xml:space="preserve">Still open (need a separate go-ahead): document sharing, multi-person profiles, encryption at rest (accepted risk, not built). Sharing and offline access are reviewed in</w:t>
+      </w:r>
+      <w:r>
+        <w:t xml:space="preserve"> </w:t>
+      </w:r>
+      <w:r>
+        <w:rPr>
+          <w:rStyle w:val="VerbatimChar"/>
+        </w:rPr>
+        <w:t xml:space="preserve">sharing_offline_review.md</w:t>
+      </w:r>
+      <w:r>
+        <w:t xml:space="preserve"> </w:t>
+      </w:r>
+      <w:r>
+        <w:t xml:space="preserve">(Build 40).</w:t>
       </w:r>
     </w:p>
     <w:bookmarkEnd w:id="38"/>
@@ -1627,7 +1714,7 @@
               <w:jc w:val="left"/>
             </w:pPr>
             <w:r>
-              <w:t xml:space="preserve">37</w:t>
+              <w:t xml:space="preserve">43</w:t>
             </w:r>
           </w:p>
         </w:tc>

</xml_diff>

<commit_message>
LockonDocs backup - 2026-10-18 14:04:51 UTC
</commit_message>
<xml_diff>
--- a/docs/CUSTOM_INSTRUCTIONS.docx
+++ b/docs/CUSTOM_INSTRUCTIONS.docx
@@ -600,7 +600,7 @@
         <w:t xml:space="preserve">build_state.md</w:t>
       </w:r>
       <w:r>
-        <w:t xml:space="preserve">. Current counter: 43.</w:t>
+        <w:t xml:space="preserve">. Current counter: 49.</w:t>
       </w:r>
     </w:p>
     <w:p>
@@ -1363,22 +1363,7 @@
         <w:pStyle w:val="Compact"/>
       </w:pPr>
       <w:r>
-        <w:t xml:space="preserve">Still open (need a separate go-ahead): document sharing, multi-person profiles, encryption at rest (accepted risk, not built). Sharing and offline access are reviewed in</w:t>
-      </w:r>
-      <w:r>
-        <w:t xml:space="preserve"> </w:t>
-      </w:r>
-      <w:r>
-        <w:rPr>
-          <w:rStyle w:val="VerbatimChar"/>
-        </w:rPr>
-        <w:t xml:space="preserve">sharing_offline_review.md</w:t>
-      </w:r>
-      <w:r>
-        <w:t xml:space="preserve"> </w:t>
-      </w:r>
-      <w:r>
-        <w:t xml:space="preserve">(Build 40).</w:t>
+        <w:t xml:space="preserve">Secure document sharing: original-scope work approved by Richard, implemented in Build 46. No recipient account; required passcode delivered separately, owner password confirmation, expiring/revocable links, optional downloads, access history. See files.md. Multi-person profiles, emergency access and application-level encryption remain outside this implementation.</w:t>
       </w:r>
     </w:p>
     <w:bookmarkEnd w:id="38"/>
@@ -1714,7 +1699,7 @@
               <w:jc w:val="left"/>
             </w:pPr>
             <w:r>
-              <w:t xml:space="preserve">43</w:t>
+              <w:t xml:space="preserve">49</w:t>
             </w:r>
           </w:p>
         </w:tc>

</xml_diff>